<commit_message>
feat: add per-person investigator workflow
</commit_message>
<xml_diff>
--- a/NexusDocs/templates/extensions/extension_to_10_days.docx
+++ b/NexusDocs/templates/extensions/extension_to_10_days.docx
@@ -432,7 +432,7 @@
               <w:jc w:val="center"/>
             </w:pPr>
             <w:r>
-              <w:t>Цомартов С.А.</w:t>
+              <w:t xml:space="preserve">{{INVESTIGATOR_SURNAME_INITIALS}}</w:t>
             </w:r>
           </w:p>
         </w:tc>
@@ -520,7 +520,7 @@
               <w:jc w:val="center"/>
             </w:pPr>
             <w:r>
-              <w:t>Цомартов С.А.</w:t>
+              <w:t xml:space="preserve">{{INVESTIGATOR_SURNAME_INITIALS}}</w:t>
             </w:r>
           </w:p>
         </w:tc>
@@ -602,7 +602,7 @@
               <w:jc w:val="center"/>
             </w:pPr>
             <w:r>
-              <w:t>Цомартов С.А.</w:t>
+              <w:t xml:space="preserve">{{INVESTIGATOR_SURNAME_INITIALS}}</w:t>
             </w:r>
           </w:p>
         </w:tc>
@@ -686,7 +686,7 @@
               <w:jc w:val="center"/>
             </w:pPr>
             <w:r>
-              <w:t>Цомартов С.А.</w:t>
+              <w:t xml:space="preserve">{{INVESTIGATOR_SURNAME_INITIALS}}</w:t>
             </w:r>
           </w:p>
         </w:tc>
@@ -765,7 +765,7 @@
               <w:jc w:val="center"/>
             </w:pPr>
             <w:r>
-              <w:t>Цомартов С.А.</w:t>
+              <w:t xml:space="preserve">{{INVESTIGATOR_SURNAME_INITIALS}}</w:t>
             </w:r>
           </w:p>
         </w:tc>
@@ -938,7 +938,7 @@
         <w:rPr>
           <w:bCs/>
         </w:rPr>
-        <w:t>Следователь военного следственного отдела</w:t>
+        <w:t xml:space="preserve">{{INVESTIGATOR_POSITION_LONG}}</w:t>
       </w:r>
     </w:p>
     <w:p>
@@ -1001,7 +1001,7 @@
         <w:rPr>
           <w:bCs/>
         </w:rPr>
-        <w:t xml:space="preserve">лейтенант юстиции </w:t>
+        <w:t xml:space="preserve">{{INVESTIGATOR_RANK}} </w:t>
       </w:r>
       <w:r>
         <w:rPr>
@@ -1032,7 +1032,7 @@
         <w:rPr>
           <w:bCs/>
         </w:rPr>
-        <w:t>С.А. Цомартов</w:t>
+        <w:t xml:space="preserve">{{INVESTIGATOR_INITIALS_SURNAME}}</w:t>
       </w:r>
     </w:p>
     <w:p>
@@ -1796,7 +1796,7 @@
         <w:rPr>
           <w:lang w:eastAsia="en-US"/>
         </w:rPr>
-        <w:t xml:space="preserve">Следователь военного следственного отдела СК России по Власихинскому гарнизону лейтенант юстиции Цомартов С.А., рассмотрев сообщение о преступлении – рапорт старшего следователя-криминалиста военного следственного отдела СК России </w:t>
+        <w:t xml:space="preserve">{{INVESTIGATOR_POSITION_LONG}} СК России по Власихинскому гарнизону {{INVESTIGATOR_RANK}} {{INVESTIGATOR_SURNAME_INITIALS}}, рассмотрев сообщение о преступлении – рапорт старшего следователя-криминалиста военного следственного отдела СК России </w:t>
         <w:br/>
         <w:t xml:space="preserve">по Власихинскому гарнизону подполковника юстиции Саркисяна А.К. об обнаружении </w:t>
         <w:br/>
@@ -2810,7 +2810,7 @@
         <w:jc w:val="both"/>
       </w:pPr>
       <w:r>
-        <w:t xml:space="preserve">Следователь </w:t>
+        <w:t xml:space="preserve">{{INVESTIGATOR_POSITION_SHORT}} </w:t>
       </w:r>
     </w:p>
     <w:p>
@@ -2856,10 +2856,10 @@
         </w:sectPr>
       </w:pPr>
       <w:r>
-        <w:t xml:space="preserve">лейтенант юстиции                                                                                                      </w:t>
-      </w:r>
-      <w:r>
-        <w:t>С.А. Цомартов</w:t>
+        <w:t xml:space="preserve">{{INVESTIGATOR_RANK}}                                                                                                      </w:t>
+      </w:r>
+      <w:r>
+        <w:t xml:space="preserve">{{INVESTIGATOR_INITIALS_SURNAME}}</w:t>
       </w:r>
     </w:p>
     <w:p>
@@ -3609,7 +3609,7 @@
           <w:sz w:val="26"/>
           <w:szCs w:val="26"/>
         </w:rPr>
-        <w:t>Следователь военного следственного отдела</w:t>
+        <w:t xml:space="preserve">{{INVESTIGATOR_POSITION_LONG}}</w:t>
       </w:r>
     </w:p>
     <w:p>
@@ -3665,7 +3665,7 @@
           <w:sz w:val="26"/>
           <w:szCs w:val="26"/>
         </w:rPr>
-        <w:t xml:space="preserve">лейтенант юстиции        </w:t>
+        <w:t xml:space="preserve">{{INVESTIGATOR_RANK}}        </w:t>
       </w:r>
       <w:r>
         <w:rPr>
@@ -3724,7 +3724,7 @@
           <w:sz w:val="26"/>
           <w:szCs w:val="26"/>
         </w:rPr>
-        <w:t>С.А. Цомартов</w:t>
+        <w:t xml:space="preserve">{{INVESTIGATOR_INITIALS_SURNAME}}</w:t>
       </w:r>
     </w:p>
     <w:p>

</xml_diff>

<commit_message>
feat: expand request generation workflows
</commit_message>
<xml_diff>
--- a/NexusDocs/templates/extensions/extension_to_10_days.docx
+++ b/NexusDocs/templates/extensions/extension_to_10_days.docx
@@ -38,22 +38,22 @@
           <w:b/>
           <w:szCs w:val="26"/>
         </w:rPr>
-        <w:t xml:space="preserve">Руководитель ВСО СК России </w:t>
-      </w:r>
-      <w:r>
-        <w:rPr>
-          <w:b/>
-          <w:szCs w:val="26"/>
-        </w:rPr>
+        <w:t xml:space="preserve">Заместитель руководителя ВСО СК России </w:t>
         <w:br/>
-      </w:r>
-      <w:r>
-        <w:rPr>
-          <w:b/>
-          <w:szCs w:val="26"/>
-        </w:rPr>
         <w:t xml:space="preserve">по Власихинскому гарнизону </w:t>
       </w:r>
+      <w:r>
+        <w:rPr>
+          <w:b/>
+          <w:szCs w:val="26"/>
+        </w:rPr>
+      </w:r>
+      <w:r>
+        <w:rPr>
+          <w:b/>
+          <w:szCs w:val="26"/>
+        </w:rPr>
+      </w:r>
     </w:p>
     <w:p>
       <w:pPr>
@@ -68,7 +68,7 @@
           <w:b/>
           <w:szCs w:val="26"/>
         </w:rPr>
-        <w:t xml:space="preserve">п/п-к юст.                     О.Р. Агиров </w:t>
+        <w:t xml:space="preserve">п/п-к юст.                     В.Н. Литвинов </w:t>
       </w:r>
     </w:p>
     <w:p>
@@ -1096,7 +1096,7 @@
           <w:sz w:val="24"/>
           <w:szCs w:val="24"/>
         </w:rPr>
-        <w:t>Руководитель</w:t>
+        <w:t>Заместитель руководителя</w:t>
       </w:r>
     </w:p>
     <w:p>
@@ -1250,7 +1250,7 @@
                       <w:sz w:val="24"/>
                       <w:szCs w:val="24"/>
                     </w:rPr>
-                    <w:t>О.Р. Агиров</w:t>
+                    <w:t>В.Н. Литвинов</w:t>
                   </w:r>
                 </w:p>
               </w:tc>
@@ -1482,7 +1482,7 @@
       <w:pPr>
         <w:pStyle w:val="ConsNonformat"/>
         <w:widowControl/>
-        <w:spacing w:line="180" w:lineRule="exact"/>
+        <w:spacing w:line="100" w:lineRule="exact"/>
         <w:rPr>
           <w:rFonts w:ascii="Times New Roman" w:hAnsi="Times New Roman" w:cs="Times New Roman"/>
           <w:sz w:val="24"/>
@@ -1775,6 +1775,7 @@
     </w:p>
     <w:p>
       <w:pPr>
+        <w:spacing w:line="100" w:lineRule="exact"/>
         <w:ind w:firstLine="708"/>
         <w:jc w:val="both"/>
         <w:rPr>
@@ -1796,11 +1797,7 @@
         <w:rPr>
           <w:lang w:eastAsia="en-US"/>
         </w:rPr>
-        <w:t xml:space="preserve">{{INVESTIGATOR_POSITION_LONG}} СК России по Власихинскому гарнизону {{INVESTIGATOR_RANK}} {{INVESTIGATOR_SURNAME_INITIALS}}, рассмотрев сообщение о преступлении – рапорт старшего следователя-криминалиста военного следственного отдела СК России </w:t>
-        <w:br/>
-        <w:t xml:space="preserve">по Власихинскому гарнизону подполковника юстиции Саркисяна А.К. об обнаружении </w:t>
-        <w:br/>
-        <w:t>в действиях военнослужащего в/части {{MILITARY_UNIT}} {{MILITARY_RANK_GENITIVE}} {{FULL_NAME_GENITIVE}} признаков преступления, предусмотренного {{ARTICLE}}, и материалы проверки,</w:t>
+        <w:t>{{INVESTIGATOR_POSITION_LONG}} СК России по Власихинскому гарнизону {{INVESTIGATOR_RANK}} {{INVESTIGATOR_SURNAME_INITIALS}}, рассмотрев сообщение о преступлении – собственный рапорт об обнаружении в действиях военнослужащего в/части {{MILITARY_UNIT}} {{MILITARY_RANK_GENITIVE}} {{FULL_NAME_GENITIVE}} признаков преступления, предусмотренного {{ARTICLE}}, и материалы проверки,</w:t>
       </w:r>
       <w:r>
         <w:rPr>
@@ -1912,6 +1909,18 @@
           <w:lang w:eastAsia="en-US"/>
         </w:rPr>
       </w:r>
+    </w:p>
+    <w:p>
+      <w:pPr>
+        <w:spacing w:line="80" w:lineRule="exact"/>
+        <w:jc w:val="center"/>
+        <w:rPr>
+          <w:rFonts w:eastAsia="Lucida Sans Unicode"/>
+          <w:b/>
+          <w:bCs/>
+          <w:lang w:eastAsia="x-none"/>
+        </w:rPr>
+      </w:pPr>
     </w:p>
     <w:p>
       <w:pPr>
@@ -1924,31 +1933,19 @@
           <w:lang w:eastAsia="x-none"/>
         </w:rPr>
       </w:pPr>
-    </w:p>
-    <w:p>
-      <w:pPr>
-        <w:spacing w:line="240" w:lineRule="exact"/>
-        <w:jc w:val="center"/>
+      <w:r>
         <w:rPr>
           <w:rFonts w:eastAsia="Lucida Sans Unicode"/>
           <w:b/>
           <w:bCs/>
           <w:lang w:eastAsia="x-none"/>
         </w:rPr>
-      </w:pPr>
-      <w:r>
-        <w:rPr>
-          <w:rFonts w:eastAsia="Lucida Sans Unicode"/>
-          <w:b/>
-          <w:bCs/>
-          <w:lang w:eastAsia="x-none"/>
-        </w:rPr>
         <w:t>УСТАНОВИЛ:</w:t>
       </w:r>
     </w:p>
     <w:p>
       <w:pPr>
-        <w:spacing w:line="240" w:lineRule="exact"/>
+        <w:spacing w:line="80" w:lineRule="exact"/>
         <w:jc w:val="center"/>
         <w:rPr>
           <w:rFonts w:eastAsia="Lucida Sans Unicode"/>
@@ -2437,7 +2434,7 @@
           <w:sz w:val="24"/>
           <w:szCs w:val="24"/>
         </w:rPr>
-        <w:t>{{REGISTRATION_DATE}} {{FULL_NAME_INITIALS}} добровольно обратился в ВСО СК России по Власихинскому гарнизону, расположенный по адресу: Московская область, пос. Власиха, ул. Лесная, д. 37, где заявил о себе как о военнослужащем, совершившим уклонение от прохождения военной службы.</w:t>
+        <w:t>{{RETURN_TO_DEPARTMENT_SENTENCE}}</w:t>
       </w:r>
       <w:r>
         <w:rPr>
@@ -2687,7 +2684,7 @@
     </w:p>
     <w:p>
       <w:pPr>
-        <w:spacing w:line="240" w:lineRule="exact"/>
+        <w:spacing w:line="80" w:lineRule="exact"/>
         <w:ind w:firstLine="709"/>
         <w:jc w:val="both"/>
         <w:rPr>
@@ -2726,7 +2723,7 @@
       <w:pPr>
         <w:pStyle w:val="ConsNonformat"/>
         <w:widowControl/>
-        <w:spacing w:line="240" w:lineRule="exact"/>
+        <w:spacing w:line="80" w:lineRule="exact"/>
         <w:jc w:val="center"/>
         <w:outlineLvl w:val="0"/>
         <w:rPr>
@@ -2758,9 +2755,9 @@
           <w:sz w:val="24"/>
           <w:szCs w:val="24"/>
         </w:rPr>
-        <w:t xml:space="preserve">Ходатайствовать перед руководителем военного следственного отдела СК России </w:t>
+        <w:t xml:space="preserve">Ходатайствовать перед заместителем руководителя военного следственного отдела СК России </w:t>
         <w:br/>
-        <w:t>по Власихинскому гарнизону подполковником юстиции Агировым О.Р. о продлении срока проверки сообщения о преступлении до 10 (десяти) суток, то есть по {{TEN_DAY_DATE}}.</w:t>
+        <w:t>по Власихинскому гарнизону подполковником юстиции Литвиновым В.Н. о продлении срока проверки сообщения о преступлении до 10 (десяти) суток, то есть по {{TEN_DAY_DATE}}.</w:t>
       </w:r>
       <w:r>
         <w:rPr>
@@ -2797,12 +2794,21 @@
           <w:lang w:eastAsia="en-US"/>
         </w:rPr>
       </w:r>
+    </w:p>
+    <w:p>
+      <w:pPr>
+        <w:spacing w:line="120" w:lineRule="exact"/>
+        <w:jc w:val="both"/>
+      </w:pPr>
     </w:p>
     <w:p>
       <w:pPr>
         <w:spacing w:line="240" w:lineRule="exact"/>
         <w:jc w:val="both"/>
       </w:pPr>
+      <w:r>
+        <w:t xml:space="preserve">{{INVESTIGATOR_POSITION_SHORT}} </w:t>
+      </w:r>
     </w:p>
     <w:p>
       <w:pPr>
@@ -2810,7 +2816,7 @@
         <w:jc w:val="both"/>
       </w:pPr>
       <w:r>
-        <w:t xml:space="preserve">{{INVESTIGATOR_POSITION_SHORT}} </w:t>
+        <w:t>военного следственного отдела</w:t>
       </w:r>
     </w:p>
     <w:p>
@@ -2819,15 +2825,6 @@
         <w:jc w:val="both"/>
       </w:pPr>
       <w:r>
-        <w:t>военного следственного отдела</w:t>
-      </w:r>
-    </w:p>
-    <w:p>
-      <w:pPr>
-        <w:spacing w:line="240" w:lineRule="exact"/>
-        <w:jc w:val="both"/>
-      </w:pPr>
-      <w:r>
         <w:t xml:space="preserve">СК России </w:t>
       </w:r>
       <w:r>
@@ -2836,7 +2833,7 @@
     </w:p>
     <w:p>
       <w:pPr>
-        <w:spacing w:line="240" w:lineRule="exact"/>
+        <w:spacing w:line="120" w:lineRule="exact"/>
         <w:jc w:val="both"/>
         <w:rPr>
           <w:sz w:val="16"/>
@@ -3058,7 +3055,7 @@
           <w:sz w:val="26"/>
           <w:szCs w:val="26"/>
         </w:rPr>
-        <w:t xml:space="preserve">Руководитель военного следственного отдела СК России по Власихинскому гарнизону подполковник юстиции Агиров О.Р., рассмотрев материалы доследственной проверки в отношении военнослужащего в/части {{MILITARY_UNIT}} {{MILITARY_RANK_GENITIVE}} </w:t>
+        <w:t xml:space="preserve">Заместитель руководителя военного следственного отдела СК России по Власихинскому гарнизону подполковник юстиции Литвинов В.Н., рассмотрев материалы доследственной проверки в отношении военнослужащего в/части {{MILITARY_UNIT}} {{MILITARY_RANK_GENITIVE}} </w:t>
         <w:br/>
         <w:t>{{FULL_NAME_INITIALS_GENITIVE}}, по признакам преступления, предусмотренного {{ARTICLE}}, руководствуясь п. 3 ч. 1 и ч. 3 ст. 39 УПК РФ, предлагаю выполнить следующее:</w:t>
       </w:r>
@@ -3394,7 +3391,7 @@
           <w:sz w:val="26"/>
           <w:szCs w:val="26"/>
         </w:rPr>
-        <w:t>Руководитель</w:t>
+        <w:t>Заместитель руководителя</w:t>
       </w:r>
       <w:r>
         <w:rPr>
@@ -3459,93 +3456,88 @@
           <w:szCs w:val="26"/>
         </w:rPr>
         <w:t xml:space="preserve">подполковник юстиции        </w:t>
-      </w:r>
-      <w:r>
-        <w:rPr>
-          <w:sz w:val="26"/>
-          <w:szCs w:val="26"/>
-        </w:rPr>
         <w:tab/>
-      </w:r>
-      <w:r>
-        <w:rPr>
-          <w:sz w:val="26"/>
-          <w:szCs w:val="26"/>
-        </w:rPr>
         <w:tab/>
-      </w:r>
-      <w:r>
-        <w:rPr>
-          <w:sz w:val="26"/>
-          <w:szCs w:val="26"/>
-        </w:rPr>
         <w:tab/>
         <w:t xml:space="preserve">      </w:t>
-      </w:r>
-      <w:r>
-        <w:rPr>
-          <w:sz w:val="26"/>
-          <w:szCs w:val="26"/>
-        </w:rPr>
         <w:tab/>
-      </w:r>
-      <w:r>
-        <w:rPr>
-          <w:sz w:val="26"/>
-          <w:szCs w:val="26"/>
-        </w:rPr>
         <w:tab/>
-      </w:r>
-      <w:r>
-        <w:rPr>
-          <w:sz w:val="26"/>
-          <w:szCs w:val="26"/>
-        </w:rPr>
         <w:tab/>
         <w:t xml:space="preserve">  </w:t>
-      </w:r>
-      <w:r>
-        <w:rPr>
-          <w:sz w:val="26"/>
-          <w:szCs w:val="26"/>
-        </w:rPr>
         <w:tab/>
-        <w:t xml:space="preserve">   </w:t>
-      </w:r>
-      <w:r>
-        <w:rPr>
-          <w:sz w:val="26"/>
-          <w:szCs w:val="26"/>
-        </w:rPr>
-        <w:t>О</w:t>
-      </w:r>
-      <w:r>
-        <w:rPr>
-          <w:sz w:val="26"/>
-          <w:szCs w:val="26"/>
-        </w:rPr>
-        <w:t>.</w:t>
-      </w:r>
-      <w:r>
-        <w:rPr>
-          <w:sz w:val="26"/>
-          <w:szCs w:val="26"/>
-        </w:rPr>
-        <w:t>Р</w:t>
-      </w:r>
-      <w:r>
-        <w:rPr>
-          <w:sz w:val="26"/>
-          <w:szCs w:val="26"/>
-        </w:rPr>
-        <w:t xml:space="preserve">. </w:t>
-      </w:r>
-      <w:r>
-        <w:rPr>
-          <w:sz w:val="26"/>
-          <w:szCs w:val="26"/>
-        </w:rPr>
-        <w:t>Агиров</w:t>
+        <w:t xml:space="preserve">   В.Н. Литвинов</w:t>
+      </w:r>
+      <w:r>
+        <w:rPr>
+          <w:sz w:val="26"/>
+          <w:szCs w:val="26"/>
+        </w:rPr>
+      </w:r>
+      <w:r>
+        <w:rPr>
+          <w:sz w:val="26"/>
+          <w:szCs w:val="26"/>
+        </w:rPr>
+      </w:r>
+      <w:r>
+        <w:rPr>
+          <w:sz w:val="26"/>
+          <w:szCs w:val="26"/>
+        </w:rPr>
+      </w:r>
+      <w:r>
+        <w:rPr>
+          <w:sz w:val="26"/>
+          <w:szCs w:val="26"/>
+        </w:rPr>
+      </w:r>
+      <w:r>
+        <w:rPr>
+          <w:sz w:val="26"/>
+          <w:szCs w:val="26"/>
+        </w:rPr>
+      </w:r>
+      <w:r>
+        <w:rPr>
+          <w:sz w:val="26"/>
+          <w:szCs w:val="26"/>
+        </w:rPr>
+      </w:r>
+      <w:r>
+        <w:rPr>
+          <w:sz w:val="26"/>
+          <w:szCs w:val="26"/>
+        </w:rPr>
+      </w:r>
+      <w:r>
+        <w:rPr>
+          <w:sz w:val="26"/>
+          <w:szCs w:val="26"/>
+        </w:rPr>
+      </w:r>
+      <w:r>
+        <w:rPr>
+          <w:sz w:val="26"/>
+          <w:szCs w:val="26"/>
+        </w:rPr>
+      </w:r>
+      <w:r>
+        <w:rPr>
+          <w:sz w:val="26"/>
+          <w:szCs w:val="26"/>
+        </w:rPr>
+      </w:r>
+      <w:r>
+        <w:rPr>
+          <w:sz w:val="26"/>
+          <w:szCs w:val="26"/>
+        </w:rPr>
+      </w:r>
+      <w:r>
+        <w:rPr>
+          <w:sz w:val="26"/>
+          <w:szCs w:val="26"/>
+        </w:rPr>
       </w:r>
     </w:p>
     <w:p>

</xml_diff>